<commit_message>
Family letter: remove the Teacher's Note section (EN/ES)
Mirrors FL-Curriculum's update so the downloadable copy matches.

Co-Authored-By: Claude Sonnet 5 <noreply@anthropic.com>
</commit_message>
<xml_diff>
--- a/public/downloads/family/college-project-family-letter-fall.docx
+++ b/public/downloads/family/college-project-family-letter-fall.docx
@@ -407,36 +407,6 @@
     </w:p>
     <w:p>
       <w:pPr>
-        <w:spacing w:before="280" w:after="80"/>
-      </w:pPr>
-      <w:r>
-        <w:rPr>
-          <w:rFonts w:ascii="Georgia" w:hAnsi="Georgia"/>
-          <w:b/>
-          <w:i w:val="0"/>
-          <w:color w:val="0B1D3A"/>
-          <w:sz w:val="26"/>
-        </w:rPr>
-        <w:t>A note from your teacher</w:t>
-      </w:r>
-    </w:p>
-    <w:p>
-      <w:pPr>
-        <w:spacing w:before="0" w:after="160"/>
-      </w:pPr>
-      <w:r>
-        <w:rPr>
-          <w:rFonts w:ascii="Georgia" w:hAnsi="Georgia"/>
-          <w:b w:val="0"/>
-          <w:i w:val="0"/>
-          <w:color w:val="1A1A1A"/>
-          <w:sz w:val="22"/>
-        </w:rPr>
-        <w:t>[OPTIONAL PERSONAL NOTE. For example: I let my financial services licenses lapse more than a decade ago; in this class I teach as an educator, not an advisor.]</w:t>
-      </w:r>
-    </w:p>
-    <w:p>
-      <w:pPr>
         <w:spacing w:before="0" w:after="160"/>
       </w:pPr>
       <w:r>
@@ -448,21 +418,6 @@
           <w:sz w:val="20"/>
         </w:rPr>
         <w:t>This letter and this course are for education and information only. They are not financial, legal, or tax advice. Costs, aid programs, and deadlines change, so confirm current numbers with each school or program before you decide.</w:t>
-      </w:r>
-    </w:p>
-    <w:p>
-      <w:pPr>
-        <w:spacing w:before="200" w:after="160"/>
-      </w:pPr>
-      <w:r>
-        <w:rPr>
-          <w:rFonts w:ascii="Georgia" w:hAnsi="Georgia"/>
-          <w:b/>
-          <w:i w:val="0"/>
-          <w:color w:val="0B1D3A"/>
-          <w:sz w:val="22"/>
-        </w:rPr>
-        <w:t>[TEACHER NAME] · The College Project · thefinancelab.co</w:t>
       </w:r>
     </w:p>
     <w:p>
@@ -891,36 +846,6 @@
     </w:p>
     <w:p>
       <w:pPr>
-        <w:spacing w:before="280" w:after="80"/>
-      </w:pPr>
-      <w:r>
-        <w:rPr>
-          <w:rFonts w:ascii="Georgia" w:hAnsi="Georgia"/>
-          <w:b/>
-          <w:i w:val="0"/>
-          <w:color w:val="0B1D3A"/>
-          <w:sz w:val="26"/>
-        </w:rPr>
-        <w:t>Una nota de su maestro/a</w:t>
-      </w:r>
-    </w:p>
-    <w:p>
-      <w:pPr>
-        <w:spacing w:before="0" w:after="160"/>
-      </w:pPr>
-      <w:r>
-        <w:rPr>
-          <w:rFonts w:ascii="Georgia" w:hAnsi="Georgia"/>
-          <w:b w:val="0"/>
-          <w:i w:val="0"/>
-          <w:color w:val="1A1A1A"/>
-          <w:sz w:val="22"/>
-        </w:rPr>
-        <w:t>[NOTA PERSONAL OPCIONAL.]</w:t>
-      </w:r>
-    </w:p>
-    <w:p>
-      <w:pPr>
         <w:spacing w:before="0" w:after="160"/>
       </w:pPr>
       <w:r>
@@ -932,21 +857,6 @@
           <w:sz w:val="20"/>
         </w:rPr>
         <w:t>Esta carta y este curso son solo para fines educativos e informativos. No son asesoría financiera, legal ni fiscal. Los costos, los programas de ayuda y las fechas límite cambian; confirme las cifras actuales con cada universidad o programa antes de decidir.</w:t>
-      </w:r>
-    </w:p>
-    <w:p>
-      <w:pPr>
-        <w:spacing w:before="200" w:after="160"/>
-      </w:pPr>
-      <w:r>
-        <w:rPr>
-          <w:rFonts w:ascii="Georgia" w:hAnsi="Georgia"/>
-          <w:b/>
-          <w:i w:val="0"/>
-          <w:color w:val="0B1D3A"/>
-          <w:sz w:val="22"/>
-        </w:rPr>
-        <w:t>[NOMBRE DEL MAESTRO / DE LA MAESTRA] · The College Project · thefinancelab.co</w:t>
       </w:r>
     </w:p>
     <w:sectPr>

</xml_diff>